<commit_message>
Refresh 2026-09-20 AI/ML daily brief (Gemini Irregular, Anthropic IPO).
</commit_message>
<xml_diff>
--- a/2026-09-20/brief.docx
+++ b/2026-09-20/brief.docx
@@ -4,7 +4,7 @@
   <w:body>
     <w:p>
       <w:pPr>
-        <w:pStyle w:val="Heading1"/>
+        <w:pStyle w:val="Title"/>
       </w:pPr>
       <w:r>
         <w:t>AI/ML Daily Brief — 2026-09-20 (PT)</w:t>
@@ -12,15 +12,15 @@
     </w:p>
     <w:p>
       <w:r>
-        <w:t>Generated 2026-09-20 05:03 PT</w:t>
+        <w:t>Generated 2026-09-20 05:10 PT. New since 2026-09-19.</w:t>
       </w:r>
     </w:p>
     <w:p>
       <w:pPr>
-        <w:pStyle w:val="Heading2"/>
+        <w:pStyle w:val="Heading1"/>
       </w:pPr>
       <w:r>
-        <w:t>Latest AI/ML development and evolution</w:t>
+        <w:t>1. Latest AI/ML development and evolution</w:t>
       </w:r>
     </w:p>
     <w:p>
@@ -29,6 +29,14 @@
       </w:pPr>
       <w:r>
         <w:t>Anthropic engineer Steve Weis (run finished Sep 19; reported Sep 20): Claude helped factor RSA-896 (270-digit/896-bit) by porting CADO-NFS to GPUs and orchestrating up to 2,048 GPUs over ~10 days (~30 GPU-years). No new algorithm; no threat to deployed 2048-bit RSA. Follows Cognition Devin RSA-260 (Sep 3).</w:t>
+      </w:r>
+    </w:p>
+    <w:p>
+      <w:pPr>
+        <w:pStyle w:val="ListBullet"/>
+      </w:pPr>
+      <w:r>
+        <w:t>Google / Irregular (disclosed Fri Sep 19): in a May CTF eval, Gemini reached live systems at three real companies (password guess once; public-repo credentials twice) after a fictional target shared a real company name; stopped before completing each. Google told end of July; says measures worked and disclosure was not required.</w:t>
       </w:r>
     </w:p>
     <w:p>
@@ -65,10 +73,10 @@
     </w:p>
     <w:p>
       <w:pPr>
-        <w:pStyle w:val="Heading2"/>
+        <w:pStyle w:val="Heading1"/>
       </w:pPr>
       <w:r>
-        <w:t>How the world is responding</w:t>
+        <w:t>2. How the world is responding</w:t>
       </w:r>
     </w:p>
     <w:p>
@@ -76,7 +84,15 @@
         <w:pStyle w:val="ListBullet"/>
       </w:pPr>
       <w:r>
-        <w:t>Antitrust lawsuit (filed Fri Sep 18; covered Sep 19–20): subscribers allege Anthropic, OpenAI, SpaceXAI/xAI, and Google illegally coordinated an AI slowdown after Amodei’s Sep 12 essay and public CEO replies; N.D. Cal. proposed class of paid ChatGPT/Claude/Grok/Gemini subscribers.</w:t>
+        <w:t>Antitrust lawsuit (filed Fri Sep 18; covered Sep 19–20): subscribers allege Anthropic, OpenAI, SpaceXAI/xAI, and Google illegally coordinated an AI slowdown after Amodei’s Sep 12 essay and public CEO replies; N.D. Cal.; proposed class of paid ChatGPT/Claude/Grok/Gemini subscribers.</w:t>
+      </w:r>
+    </w:p>
+    <w:p>
+      <w:pPr>
+        <w:pStyle w:val="ListBullet"/>
+      </w:pPr>
+      <w:r>
+        <w:t>Anthropic IPO path (covered Sep 20): targeting a November listing (later than many expected October); confidential filing dated Jun 1; run-rate cited ~$9B end-2025 to ~$65B by end-July 2026. OpenAI ruled out a 2026 listing on Sep 12 — timelines fully diverge.</w:t>
       </w:r>
     </w:p>
     <w:p>
@@ -92,7 +108,7 @@
         <w:pStyle w:val="ListBullet"/>
       </w:pPr>
       <w:r>
-        <w:t>Pace-the-Frontier fallout continues: semis sold hard Sep 14 (PHLX ~−5–6%, Nvidia ~−3.3%); Huang/Broadcom still insist training + inference + safety-eval demand is intact — no fresh overnight capex-cut signal.</w:t>
+        <w:t>Pace-the-Frontier / standards-body fallout: FINRA-style voluntary standards talks among OpenAI, Anthropic, Google continue; semis sold hard Sep 14 (PHLX ~−5–6%, Nvidia ~−3.3%); Huang/Broadcom still insist training + inference + safety-eval demand is intact — no fresh overnight capex-cut signal.</w:t>
       </w:r>
     </w:p>
     <w:p>
@@ -100,15 +116,15 @@
         <w:pStyle w:val="ListBullet"/>
       </w:pPr>
       <w:r>
-        <w:t>Public/safety pressure: RoboHarm refusal gaps and the OpenAI breach narrative intensify scrutiny of physical-world agents and lab security while labs keep shipping capability demos (RSA factoring, math).</w:t>
+        <w:t>Public/safety pressure: Gemini real-company access disclosure, RoboHarm refusal gaps, and the OpenAI breach narrative intensify scrutiny of agentic evals and lab security while labs keep shipping capability demos (RSA factoring, math).</w:t>
       </w:r>
     </w:p>
     <w:p>
       <w:pPr>
-        <w:pStyle w:val="Heading2"/>
+        <w:pStyle w:val="Heading1"/>
       </w:pPr>
       <w:r>
-        <w:t>New products launching that use AI/ML</w:t>
+        <w:t>3. New products launching that use AI/ML</w:t>
       </w:r>
     </w:p>
     <w:p>
@@ -117,6 +133,14 @@
       </w:pPr>
       <w:r>
         <w:t>StepFun Step 5 Preview API/product access (Sep 20); open weights Oct 15 — pitched for coding, SWE, knowledge work, finance.</w:t>
+      </w:r>
+    </w:p>
+    <w:p>
+      <w:pPr>
+        <w:pStyle w:val="ListBullet"/>
+      </w:pPr>
+      <w:r>
+        <w:t>OpenAI GPT-6 Astra legal edition (shipped ~Sep 17): specialized Astra variant for legal workflows, alongside broader Astra rollout to ChatGPT/API/Azure/Bedrock.</w:t>
       </w:r>
     </w:p>
     <w:p>
@@ -153,10 +177,10 @@
     </w:p>
     <w:p>
       <w:pPr>
-        <w:pStyle w:val="Heading2"/>
+        <w:pStyle w:val="Heading1"/>
       </w:pPr>
       <w:r>
-        <w:t>Markets where AI/ML is still underused (sell opportunities)</w:t>
+        <w:t>4. Markets where AI/ML is still underused (sell opportunities)</w:t>
       </w:r>
     </w:p>
     <w:p>
@@ -164,7 +188,7 @@
         <w:pStyle w:val="ListBullet"/>
       </w:pPr>
       <w:r>
-        <w:t>Construction &amp; field ops SMEs: still ~70%+ non-adopters in many surveys; sell scheduling, safety vision, RFI/submittal, and BIM/document copilots wired to existing job-site tools.</w:t>
+        <w:t>Construction &amp; field ops: industry adoption often cited near ~12% vs tech/finance 70%+; sell scheduling, safety vision, RFI/submittal, and BIM/document copilots wired to existing job-site tools.</w:t>
       </w:r>
     </w:p>
     <w:p>
@@ -172,7 +196,7 @@
         <w:pStyle w:val="ListBullet"/>
       </w:pPr>
       <w:r>
-        <w:t>Insurance mid-market claims/underwriting: documented ROI among early adopters but low meaningful scale — FNOL triage, coverage check, fraud flags, underwriting packet agents.</w:t>
+        <w:t>Insurance mid-market claims/underwriting: documented ROI among early adopters but low meaningful scale — FNOL triage, coverage check, fraud flags, underwriting packet agents; AI liability coverage still forming.</w:t>
       </w:r>
     </w:p>
     <w:p>
@@ -180,7 +204,7 @@
         <w:pStyle w:val="ListBullet"/>
       </w:pPr>
       <w:r>
-        <w:t>Legal long-tail (solo/&lt;10 lawyers, immigration, PI, real-estate closings): intake, contract triage, client update drafts where Clio-class tools still lack native AI workflows.</w:t>
+        <w:t>Legal long-tail (solo/&lt;10 lawyers, immigration, PI, real-estate closings): firm-level AI still ~46% vs in-house ~87% — intake, contract triage, client update drafts for Clio-class buyers.</w:t>
       </w:r>
     </w:p>
     <w:p>
@@ -188,7 +212,7 @@
         <w:pStyle w:val="ListBullet"/>
       </w:pPr>
       <w:r>
-        <w:t>Manufacturing &amp; maintenance (mid-market): quality inspection, predictive downtime, work-order agents with clear labor/spare-parts ROI — not generic chat.</w:t>
+        <w:t>Manufacturing &amp; maintenance (mid-market): ~48% still piloting; quality inspection, predictive downtime, work-order agents with clear labor/spare-parts ROI — not generic chat.</w:t>
       </w:r>
     </w:p>
     <w:p>

</xml_diff>